<commit_message>
Add EDA analysis (population)
</commit_message>
<xml_diff>
--- a/Output/Report.docx
+++ b/Output/Report.docx
@@ -4,98 +4,535 @@
   <w:body>
     <w:p>
       <w:pPr>
-        <w:jc w:val="both"/>
-        <w:rPr>
+        <w:rPr>
+          <w:rFonts w:ascii="Times New Roman" w:hAnsi="Times New Roman" w:cs="Times New Roman"/>
+          <w:sz w:val="36"/>
+          <w:szCs w:val="36"/>
+          <w:lang w:val="sv-SE"/>
+        </w:rPr>
+      </w:pPr>
+      <w:r>
+        <w:rPr>
+          <w:rFonts w:ascii="Times New Roman" w:hAnsi="Times New Roman" w:cs="Times New Roman"/>
           <w:b/>
           <w:bCs/>
-          <w:lang w:val="sv-SE"/>
-        </w:rPr>
-      </w:pPr>
-      <w:r>
-        <w:rPr>
+          <w:sz w:val="36"/>
+          <w:szCs w:val="36"/>
+          <w:lang w:val="sv-SE"/>
+        </w:rPr>
+        <w:t>Analisis</w:t>
+      </w:r>
+      <w:r>
+        <w:rPr>
+          <w:rFonts w:ascii="Times New Roman" w:hAnsi="Times New Roman" w:cs="Times New Roman"/>
           <w:b/>
           <w:bCs/>
-          <w:lang w:val="sv-SE"/>
-        </w:rPr>
-        <w:t>Latar belakang</w:t>
+          <w:sz w:val="36"/>
+          <w:szCs w:val="36"/>
+          <w:lang w:val="sv-SE"/>
+        </w:rPr>
+        <w:t xml:space="preserve"> distribusi perokok berdasarkan</w:t>
+      </w:r>
+      <w:r>
+        <w:rPr>
+          <w:rFonts w:ascii="Times New Roman" w:hAnsi="Times New Roman" w:cs="Times New Roman"/>
+          <w:b/>
+          <w:bCs/>
+          <w:sz w:val="36"/>
+          <w:szCs w:val="36"/>
+          <w:lang w:val="sv-SE"/>
+        </w:rPr>
+        <w:t xml:space="preserve"> data</w:t>
+      </w:r>
+      <w:r>
+        <w:rPr>
+          <w:rFonts w:ascii="Times New Roman" w:hAnsi="Times New Roman" w:cs="Times New Roman"/>
+          <w:b/>
+          <w:bCs/>
+          <w:sz w:val="36"/>
+          <w:szCs w:val="36"/>
+          <w:lang w:val="sv-SE"/>
+        </w:rPr>
+        <w:t xml:space="preserve"> SUSENAS 2023 &amp; SKI 2023</w:t>
       </w:r>
     </w:p>
     <w:p>
       <w:pPr>
+        <w:rPr>
+          <w:rFonts w:ascii="Times New Roman" w:hAnsi="Times New Roman" w:cs="Times New Roman"/>
+          <w:lang w:val="sv-SE"/>
+        </w:rPr>
+      </w:pPr>
+      <w:r>
+        <w:rPr>
+          <w:rFonts w:ascii="Times New Roman" w:hAnsi="Times New Roman" w:cs="Times New Roman"/>
+          <w:lang w:val="sv-SE"/>
+        </w:rPr>
+        <w:t>Muhammad Akmal Farouqi</w:t>
+      </w:r>
+    </w:p>
+    <w:p>
+      <w:pPr>
+        <w:rPr>
+          <w:rFonts w:ascii="Times New Roman" w:hAnsi="Times New Roman" w:cs="Times New Roman"/>
+          <w:lang w:val="sv-SE"/>
+        </w:rPr>
+      </w:pPr>
+    </w:p>
+    <w:p>
+      <w:pPr>
+        <w:pStyle w:val="ListParagraph"/>
+        <w:numPr>
+          <w:ilvl w:val="0"/>
+          <w:numId w:val="6"/>
+        </w:numPr>
+        <w:ind w:left="360"/>
         <w:jc w:val="both"/>
         <w:rPr>
-          <w:lang w:val="sv-SE"/>
-        </w:rPr>
-      </w:pPr>
-      <w:r>
-        <w:rPr>
+          <w:rFonts w:ascii="Times New Roman" w:hAnsi="Times New Roman" w:cs="Times New Roman"/>
+          <w:b/>
+          <w:bCs/>
+          <w:lang w:val="sv-SE"/>
+        </w:rPr>
+      </w:pPr>
+      <w:r>
+        <w:rPr>
+          <w:rFonts w:ascii="Times New Roman" w:hAnsi="Times New Roman" w:cs="Times New Roman"/>
+          <w:b/>
+          <w:bCs/>
+          <w:lang w:val="sv-SE"/>
+        </w:rPr>
+        <w:t>Latar belakang</w:t>
+      </w:r>
+    </w:p>
+    <w:p>
+      <w:pPr>
+        <w:jc w:val="both"/>
+        <w:rPr>
+          <w:rFonts w:ascii="Times New Roman" w:hAnsi="Times New Roman" w:cs="Times New Roman"/>
+          <w:lang w:val="sv-SE"/>
+        </w:rPr>
+      </w:pPr>
+      <w:r>
+        <w:rPr>
+          <w:rFonts w:ascii="Times New Roman" w:hAnsi="Times New Roman" w:cs="Times New Roman"/>
           <w:lang w:val="sv-SE"/>
         </w:rPr>
         <w:t>P</w:t>
       </w:r>
       <w:r>
         <w:rPr>
+          <w:rFonts w:ascii="Times New Roman" w:hAnsi="Times New Roman" w:cs="Times New Roman"/>
           <w:lang w:val="sv-SE"/>
         </w:rPr>
         <w:t xml:space="preserve">revalensi perokok </w:t>
       </w:r>
       <w:r>
         <w:rPr>
+          <w:rFonts w:ascii="Times New Roman" w:hAnsi="Times New Roman" w:cs="Times New Roman"/>
           <w:lang w:val="sv-SE"/>
         </w:rPr>
         <w:t xml:space="preserve">antara SUSENAS 2023 dan SKI 2023 menunjukkan perbedaan. Analisis awal memperlihat bahwa prevalensi </w:t>
       </w:r>
       <w:r>
         <w:rPr>
+          <w:rFonts w:ascii="Times New Roman" w:hAnsi="Times New Roman" w:cs="Times New Roman"/>
           <w:i/>
           <w:iCs/>
           <w:lang w:val="sv-SE"/>
         </w:rPr>
-        <w:t>overall</w:t>
-      </w:r>
-      <w:r>
-        <w:rPr>
+        <w:t xml:space="preserve">overall </w:t>
+      </w:r>
+      <w:r>
+        <w:rPr>
+          <w:rFonts w:ascii="Times New Roman" w:hAnsi="Times New Roman" w:cs="Times New Roman"/>
+          <w:lang w:val="sv-SE"/>
+        </w:rPr>
+        <w:t xml:space="preserve">tidak jauh berbeda, namun perbedaan utamanya justru pada </w:t>
+      </w:r>
+      <w:r>
+        <w:rPr>
+          <w:rFonts w:ascii="Times New Roman" w:hAnsi="Times New Roman" w:cs="Times New Roman"/>
+          <w:lang w:val="sv-SE"/>
+        </w:rPr>
+        <w:t xml:space="preserve">prevalensi perokok anak (10-18 tahun). Maka, analisis </w:t>
+      </w:r>
+      <w:r>
+        <w:rPr>
+          <w:rFonts w:ascii="Times New Roman" w:hAnsi="Times New Roman" w:cs="Times New Roman"/>
+          <w:lang w:val="sv-SE"/>
+        </w:rPr>
+        <w:t xml:space="preserve">mendalam diperlukan untuk mengidentifikasi </w:t>
+      </w:r>
+      <w:r>
+        <w:rPr>
+          <w:rFonts w:ascii="Times New Roman" w:hAnsi="Times New Roman" w:cs="Times New Roman"/>
+          <w:lang w:val="sv-SE"/>
+        </w:rPr>
+        <w:t>perbedaan distribusi data secara rinci pada kedua data.</w:t>
+      </w:r>
+      <w:r>
+        <w:rPr>
+          <w:rFonts w:ascii="Times New Roman" w:hAnsi="Times New Roman" w:cs="Times New Roman"/>
+          <w:lang w:val="sv-SE"/>
+        </w:rPr>
+        <w:t xml:space="preserve"> Analisis ini dilakukan pada seluruh populasi </w:t>
+      </w:r>
+      <w:r>
+        <w:rPr>
+          <w:rFonts w:ascii="Times New Roman" w:hAnsi="Times New Roman" w:cs="Times New Roman"/>
+          <w:b/>
+          <w:bCs/>
+          <w:lang w:val="sv-SE"/>
+        </w:rPr>
+        <w:t>usia 10</w:t>
+      </w:r>
+      <w:r>
+        <w:rPr>
+          <w:rFonts w:ascii="Times New Roman" w:hAnsi="Times New Roman" w:cs="Times New Roman"/>
+          <w:b/>
+          <w:bCs/>
+          <w:lang w:val="sv-SE"/>
+        </w:rPr>
+        <w:t>-75 tahun</w:t>
+      </w:r>
+      <w:r>
+        <w:rPr>
+          <w:rFonts w:ascii="Times New Roman" w:hAnsi="Times New Roman" w:cs="Times New Roman"/>
+          <w:lang w:val="sv-SE"/>
+        </w:rPr>
+        <w:t xml:space="preserve"> </w:t>
+      </w:r>
+      <w:r>
+        <w:rPr>
+          <w:rFonts w:ascii="Times New Roman" w:hAnsi="Times New Roman" w:cs="Times New Roman"/>
+          <w:lang w:val="sv-SE"/>
+        </w:rPr>
+        <w:t>di Indonesia pada tahun 2023</w:t>
+      </w:r>
+      <w:r>
+        <w:rPr>
+          <w:rFonts w:ascii="Times New Roman" w:hAnsi="Times New Roman" w:cs="Times New Roman"/>
+          <w:lang w:val="sv-SE"/>
+        </w:rPr>
+        <w:t>.</w:t>
+      </w:r>
+      <w:r>
+        <w:rPr>
+          <w:rFonts w:ascii="Times New Roman" w:hAnsi="Times New Roman" w:cs="Times New Roman"/>
+          <w:lang w:val="sv-SE"/>
+        </w:rPr>
+        <w:t xml:space="preserve"> </w:t>
+      </w:r>
+      <w:r>
+        <w:rPr>
+          <w:rFonts w:ascii="Times New Roman" w:hAnsi="Times New Roman" w:cs="Times New Roman"/>
+          <w:lang w:val="sv-SE"/>
+        </w:rPr>
+        <w:t xml:space="preserve"> </w:t>
+      </w:r>
+      <w:r>
+        <w:rPr>
+          <w:rFonts w:ascii="Times New Roman" w:hAnsi="Times New Roman" w:cs="Times New Roman"/>
+          <w:lang w:val="sv-SE"/>
+        </w:rPr>
+        <w:t xml:space="preserve">Harapannya, </w:t>
+      </w:r>
+      <w:r>
+        <w:rPr>
+          <w:rFonts w:ascii="Times New Roman" w:hAnsi="Times New Roman" w:cs="Times New Roman"/>
+          <w:lang w:val="sv-SE"/>
+        </w:rPr>
+        <w:t>analisis ini memberikan gambaran detil serta indikasi sumber perbedaan antara SKI dan SUSENAS</w:t>
+      </w:r>
+    </w:p>
+    <w:p>
+      <w:pPr>
+        <w:pStyle w:val="ListParagraph"/>
+        <w:numPr>
+          <w:ilvl w:val="0"/>
+          <w:numId w:val="6"/>
+        </w:numPr>
+        <w:ind w:left="360"/>
+        <w:jc w:val="both"/>
+        <w:rPr>
+          <w:rFonts w:ascii="Times New Roman" w:hAnsi="Times New Roman" w:cs="Times New Roman"/>
+          <w:b/>
+          <w:bCs/>
+          <w:lang w:val="sv-SE"/>
+        </w:rPr>
+      </w:pPr>
+      <w:r>
+        <w:rPr>
+          <w:rFonts w:ascii="Times New Roman" w:hAnsi="Times New Roman" w:cs="Times New Roman"/>
+          <w:b/>
+          <w:bCs/>
+          <w:lang w:val="sv-SE"/>
+        </w:rPr>
+        <w:t>Metode</w:t>
+      </w:r>
+    </w:p>
+    <w:p>
+      <w:pPr>
+        <w:jc w:val="both"/>
+        <w:rPr>
+          <w:rFonts w:ascii="Times New Roman" w:hAnsi="Times New Roman" w:cs="Times New Roman"/>
+          <w:b/>
+          <w:bCs/>
+          <w:lang w:val="sv-SE"/>
+        </w:rPr>
+      </w:pPr>
+      <w:r>
+        <w:rPr>
+          <w:rFonts w:ascii="Times New Roman" w:hAnsi="Times New Roman" w:cs="Times New Roman"/>
+          <w:lang w:val="sv-SE"/>
+        </w:rPr>
+        <w:t xml:space="preserve">Metode yang digunakan adalah analisis </w:t>
+      </w:r>
+      <w:r>
+        <w:rPr>
+          <w:rFonts w:ascii="Times New Roman" w:hAnsi="Times New Roman" w:cs="Times New Roman"/>
           <w:i/>
           <w:iCs/>
           <w:lang w:val="sv-SE"/>
         </w:rPr>
-        <w:t xml:space="preserve"> </w:t>
-      </w:r>
-      <w:r>
-        <w:rPr>
-          <w:lang w:val="sv-SE"/>
-        </w:rPr>
-        <w:t xml:space="preserve">tidak jauh berbeda, namun perbedaan utamanya justru pada </w:t>
-      </w:r>
-      <w:r>
-        <w:rPr>
-          <w:lang w:val="sv-SE"/>
-        </w:rPr>
-        <w:t xml:space="preserve">prevalensi perokok anak (10-18 tahun). Maka, analisis </w:t>
-      </w:r>
-      <w:r>
-        <w:rPr>
-          <w:lang w:val="sv-SE"/>
-        </w:rPr>
-        <w:t xml:space="preserve">mendalam diperlukan untuk mengidentifikasi </w:t>
-      </w:r>
-      <w:r>
-        <w:rPr>
-          <w:lang w:val="sv-SE"/>
-        </w:rPr>
-        <w:t xml:space="preserve">perbedaan distribusi data secara rinci pada kedua data. Harapannya, </w:t>
-      </w:r>
-      <w:r>
-        <w:rPr>
-          <w:lang w:val="sv-SE"/>
-        </w:rPr>
-        <w:t>analisis ini memberikan gambaran detil serta indikasi sumber perbedaan antara SKI dan SUSENAS</w:t>
+        <w:t>exploratory data analysis</w:t>
+      </w:r>
+      <w:r>
+        <w:rPr>
+          <w:rFonts w:ascii="Times New Roman" w:hAnsi="Times New Roman" w:cs="Times New Roman"/>
+          <w:lang w:val="sv-SE"/>
+        </w:rPr>
+        <w:t xml:space="preserve"> (EDA) dan inferensial sederhana.</w:t>
       </w:r>
     </w:p>
     <w:p>
       <w:pPr>
         <w:jc w:val="both"/>
         <w:rPr>
+          <w:rFonts w:ascii="Times New Roman" w:hAnsi="Times New Roman" w:cs="Times New Roman"/>
+          <w:i/>
+          <w:iCs/>
+          <w:lang w:val="sv-SE"/>
+        </w:rPr>
+      </w:pPr>
+      <w:r>
+        <w:rPr>
+          <w:rFonts w:ascii="Times New Roman" w:hAnsi="Times New Roman" w:cs="Times New Roman"/>
+          <w:i/>
+          <w:iCs/>
+          <w:lang w:val="sv-SE"/>
+        </w:rPr>
+        <w:t>Statistik Deskriptif</w:t>
+      </w:r>
+    </w:p>
+    <w:p>
+      <w:pPr>
+        <w:jc w:val="both"/>
+        <w:rPr>
+          <w:rFonts w:ascii="Times New Roman" w:hAnsi="Times New Roman" w:cs="Times New Roman"/>
+          <w:lang w:val="sv-SE"/>
+        </w:rPr>
+      </w:pPr>
+      <w:r>
+        <w:rPr>
+          <w:rFonts w:ascii="Times New Roman" w:hAnsi="Times New Roman" w:cs="Times New Roman"/>
+          <w:lang w:val="sv-SE"/>
+        </w:rPr>
+        <w:t xml:space="preserve">EDA </w:t>
+      </w:r>
+      <w:r>
+        <w:rPr>
+          <w:rFonts w:ascii="Times New Roman" w:hAnsi="Times New Roman" w:cs="Times New Roman"/>
+          <w:lang w:val="sv-SE"/>
+        </w:rPr>
+        <w:t xml:space="preserve">melihat perbedaan distribusi data </w:t>
+      </w:r>
+      <w:r>
+        <w:rPr>
+          <w:rFonts w:ascii="Times New Roman" w:hAnsi="Times New Roman" w:cs="Times New Roman"/>
+          <w:lang w:val="sv-SE"/>
+        </w:rPr>
+        <w:t xml:space="preserve">antar berbagai kelompok; usia, jenis kelamin, dan </w:t>
+      </w:r>
+      <w:r>
+        <w:rPr>
+          <w:rFonts w:ascii="Times New Roman" w:hAnsi="Times New Roman" w:cs="Times New Roman"/>
+          <w:lang w:val="sv-SE"/>
+        </w:rPr>
+        <w:t xml:space="preserve">lokasi tinggal. </w:t>
+      </w:r>
+      <w:r>
+        <w:rPr>
+          <w:rFonts w:ascii="Times New Roman" w:hAnsi="Times New Roman" w:cs="Times New Roman"/>
+          <w:lang w:val="sv-SE"/>
+        </w:rPr>
+        <w:t xml:space="preserve">Selain itu, EDA juga melihat distribusi </w:t>
+      </w:r>
+      <w:r>
+        <w:rPr>
+          <w:rFonts w:ascii="Times New Roman" w:hAnsi="Times New Roman" w:cs="Times New Roman"/>
+          <w:lang w:val="sv-SE"/>
+        </w:rPr>
+        <w:t xml:space="preserve">populasi umum. </w:t>
+      </w:r>
+      <w:r>
+        <w:rPr>
+          <w:rFonts w:ascii="Times New Roman" w:hAnsi="Times New Roman" w:cs="Times New Roman"/>
+          <w:lang w:val="sv-SE"/>
+        </w:rPr>
+        <w:t xml:space="preserve">Pertama, dilakukan perbandingan populasi penduduk di setiap kelompok pada kedua sumber data. Kemudian, dilakukan analisis atas perbedaan konsumsi rokok pada setiap kelompok. </w:t>
+      </w:r>
+    </w:p>
+    <w:p>
+      <w:pPr>
+        <w:tabs>
+          <w:tab w:val="left" w:pos="2588"/>
+        </w:tabs>
+        <w:jc w:val="both"/>
+        <w:rPr>
+          <w:rFonts w:ascii="Times New Roman" w:hAnsi="Times New Roman" w:cs="Times New Roman"/>
+          <w:i/>
+          <w:iCs/>
+          <w:lang w:val="sv-SE"/>
+        </w:rPr>
+      </w:pPr>
+      <w:r>
+        <w:rPr>
+          <w:rFonts w:ascii="Times New Roman" w:hAnsi="Times New Roman" w:cs="Times New Roman"/>
+          <w:i/>
+          <w:iCs/>
+          <w:lang w:val="sv-SE"/>
+        </w:rPr>
+        <w:t>Statistik Inferensial</w:t>
+      </w:r>
+      <w:r>
+        <w:rPr>
+          <w:rFonts w:ascii="Times New Roman" w:hAnsi="Times New Roman" w:cs="Times New Roman"/>
+          <w:i/>
+          <w:iCs/>
+          <w:lang w:val="sv-SE"/>
+        </w:rPr>
+        <w:tab/>
+      </w:r>
+    </w:p>
+    <w:p>
+      <w:pPr>
+        <w:jc w:val="both"/>
+        <w:rPr>
+          <w:rFonts w:ascii="Times New Roman" w:hAnsi="Times New Roman" w:cs="Times New Roman"/>
+          <w:lang w:val="sv-SE"/>
+        </w:rPr>
+      </w:pPr>
+      <w:r>
+        <w:rPr>
+          <w:rFonts w:ascii="Times New Roman" w:hAnsi="Times New Roman" w:cs="Times New Roman"/>
+          <w:lang w:val="sv-SE"/>
+        </w:rPr>
+        <w:t xml:space="preserve">Kemudian </w:t>
+      </w:r>
+      <w:r>
+        <w:rPr>
+          <w:rFonts w:ascii="Times New Roman" w:hAnsi="Times New Roman" w:cs="Times New Roman"/>
+          <w:lang w:val="sv-SE"/>
+        </w:rPr>
+        <w:t xml:space="preserve">tujuan </w:t>
+      </w:r>
+      <w:r>
+        <w:rPr>
+          <w:rFonts w:ascii="Times New Roman" w:hAnsi="Times New Roman" w:cs="Times New Roman"/>
+          <w:lang w:val="sv-SE"/>
+        </w:rPr>
+        <w:t>analisis statistik inferensial melihat apakah perbedaan distribusi data SKI dan SUSENAS yang diobservasi</w:t>
+      </w:r>
+      <w:r>
+        <w:rPr>
+          <w:rFonts w:ascii="Times New Roman" w:hAnsi="Times New Roman" w:cs="Times New Roman"/>
+          <w:lang w:val="sv-SE"/>
+        </w:rPr>
+        <w:t xml:space="preserve"> adalah signifikan secara statistik </w:t>
+      </w:r>
+      <w:r>
+        <w:rPr>
+          <w:rFonts w:ascii="Times New Roman" w:hAnsi="Times New Roman" w:cs="Times New Roman"/>
+          <w:lang w:val="sv-SE"/>
+        </w:rPr>
+        <w:t>pada kelompok usia dan lokasi tinggal.</w:t>
+      </w:r>
+      <w:r>
+        <w:rPr>
+          <w:rFonts w:ascii="Times New Roman" w:hAnsi="Times New Roman" w:cs="Times New Roman"/>
+          <w:lang w:val="sv-SE"/>
+        </w:rPr>
+        <w:t xml:space="preserve"> Dalam hal ini, metode inferensial dipilh menggunakan </w:t>
+      </w:r>
+      <w:r>
+        <w:rPr>
+          <w:rFonts w:ascii="Times New Roman" w:hAnsi="Times New Roman" w:cs="Times New Roman"/>
+          <w:lang w:val="sv-SE"/>
+        </w:rPr>
+        <w:t xml:space="preserve">ANOVA, </w:t>
+      </w:r>
+      <w:r>
+        <w:rPr>
+          <w:rFonts w:ascii="Times New Roman" w:hAnsi="Times New Roman" w:cs="Times New Roman"/>
+          <w:i/>
+          <w:iCs/>
+          <w:lang w:val="sv-SE"/>
+        </w:rPr>
+        <w:t>logistic regression</w:t>
+      </w:r>
+      <w:r>
+        <w:rPr>
+          <w:rFonts w:ascii="Times New Roman" w:hAnsi="Times New Roman" w:cs="Times New Roman"/>
+          <w:i/>
+          <w:iCs/>
+          <w:lang w:val="sv-SE"/>
+        </w:rPr>
+        <w:t>,</w:t>
+      </w:r>
+      <w:r>
+        <w:rPr>
+          <w:rFonts w:ascii="Times New Roman" w:hAnsi="Times New Roman" w:cs="Times New Roman"/>
+          <w:i/>
+          <w:iCs/>
+          <w:lang w:val="sv-SE"/>
+        </w:rPr>
+        <w:t xml:space="preserve"> </w:t>
+      </w:r>
+      <w:r>
+        <w:rPr>
+          <w:rFonts w:ascii="Times New Roman" w:hAnsi="Times New Roman" w:cs="Times New Roman"/>
+          <w:lang w:val="sv-SE"/>
+        </w:rPr>
+        <w:t xml:space="preserve">dan </w:t>
+      </w:r>
+      <w:r>
+        <w:rPr>
+          <w:rFonts w:ascii="Times New Roman" w:hAnsi="Times New Roman" w:cs="Times New Roman"/>
+          <w:lang w:val="sv-SE"/>
+        </w:rPr>
+        <w:t>estimasi OLS sederhana</w:t>
+      </w:r>
+      <w:r>
+        <w:rPr>
+          <w:rFonts w:ascii="Times New Roman" w:hAnsi="Times New Roman" w:cs="Times New Roman"/>
+          <w:lang w:val="sv-SE"/>
+        </w:rPr>
+        <w:t xml:space="preserve">. </w:t>
+      </w:r>
+    </w:p>
+    <w:p>
+      <w:pPr>
+        <w:pStyle w:val="ListParagraph"/>
+        <w:numPr>
+          <w:ilvl w:val="0"/>
+          <w:numId w:val="6"/>
+        </w:numPr>
+        <w:ind w:left="360"/>
+        <w:jc w:val="both"/>
+        <w:rPr>
+          <w:rFonts w:ascii="Times New Roman" w:hAnsi="Times New Roman" w:cs="Times New Roman"/>
           <w:b/>
           <w:bCs/>
           <w:lang w:val="sv-SE"/>
@@ -103,195 +540,70 @@
       </w:pPr>
       <w:r>
         <w:rPr>
+          <w:rFonts w:ascii="Times New Roman" w:hAnsi="Times New Roman" w:cs="Times New Roman"/>
           <w:b/>
           <w:bCs/>
           <w:lang w:val="sv-SE"/>
         </w:rPr>
-        <w:t>Rencana riset</w:t>
+        <w:t>Hasil</w:t>
       </w:r>
     </w:p>
     <w:p>
       <w:pPr>
         <w:jc w:val="both"/>
         <w:rPr>
-          <w:lang w:val="sv-SE"/>
-        </w:rPr>
-      </w:pPr>
-      <w:r>
-        <w:rPr>
-          <w:lang w:val="sv-SE"/>
-        </w:rPr>
-        <w:t xml:space="preserve">Metode yang digunakan </w:t>
-      </w:r>
-      <w:r>
-        <w:rPr>
-          <w:lang w:val="sv-SE"/>
-        </w:rPr>
-        <w:t xml:space="preserve">adalah analisis statistik </w:t>
-      </w:r>
-      <w:r>
-        <w:rPr>
+          <w:rFonts w:ascii="Times New Roman" w:hAnsi="Times New Roman" w:cs="Times New Roman"/>
           <w:i/>
           <w:iCs/>
           <w:lang w:val="sv-SE"/>
         </w:rPr>
-        <w:t>exploratory data analysis</w:t>
-      </w:r>
-      <w:r>
-        <w:rPr>
-          <w:lang w:val="sv-SE"/>
-        </w:rPr>
-        <w:t xml:space="preserve"> (EDA) </w:t>
-      </w:r>
-      <w:r>
-        <w:rPr>
-          <w:lang w:val="sv-SE"/>
-        </w:rPr>
-        <w:t xml:space="preserve">dan inferensial sederhana. </w:t>
-      </w:r>
-      <w:r>
-        <w:rPr>
-          <w:lang w:val="sv-SE"/>
-        </w:rPr>
-        <w:t xml:space="preserve">EDA </w:t>
-      </w:r>
-      <w:r>
-        <w:rPr>
-          <w:lang w:val="sv-SE"/>
-        </w:rPr>
-        <w:t xml:space="preserve">melihat perbedaan distribusi data </w:t>
-      </w:r>
-      <w:r>
-        <w:rPr>
-          <w:lang w:val="sv-SE"/>
-        </w:rPr>
-        <w:t xml:space="preserve">antar berbagai kelompok; usia, jenis kelamin, dan </w:t>
-      </w:r>
-      <w:r>
-        <w:rPr>
-          <w:lang w:val="sv-SE"/>
-        </w:rPr>
-        <w:t xml:space="preserve">lokasi tinggal. </w:t>
-      </w:r>
-      <w:r>
-        <w:rPr>
-          <w:lang w:val="sv-SE"/>
-        </w:rPr>
-        <w:t xml:space="preserve">Selain itu, EDA juga melihat distribusi </w:t>
-      </w:r>
-      <w:r>
-        <w:rPr>
-          <w:lang w:val="sv-SE"/>
-        </w:rPr>
-        <w:t xml:space="preserve">populasi umum. </w:t>
-      </w:r>
-      <w:r>
-        <w:rPr>
-          <w:lang w:val="sv-SE"/>
-        </w:rPr>
-        <w:t xml:space="preserve">Kemudian </w:t>
-      </w:r>
-      <w:r>
-        <w:rPr>
-          <w:lang w:val="sv-SE"/>
-        </w:rPr>
-        <w:t xml:space="preserve">tujuan </w:t>
-      </w:r>
-      <w:r>
-        <w:rPr>
-          <w:lang w:val="sv-SE"/>
-        </w:rPr>
-        <w:t>analisis statistik inferensial melihat apakah perbedaan distribusi data SKI dan SUSENAS yang diobservasi</w:t>
-      </w:r>
-      <w:r>
-        <w:rPr>
-          <w:lang w:val="sv-SE"/>
-        </w:rPr>
-        <w:t xml:space="preserve"> adalah signifikan secara statistik </w:t>
-      </w:r>
-      <w:r>
-        <w:rPr>
-          <w:lang w:val="sv-SE"/>
-        </w:rPr>
-        <w:t>pada kelompok usia dan lokasi tinggal.</w:t>
-      </w:r>
-      <w:r>
-        <w:rPr>
-          <w:lang w:val="sv-SE"/>
-        </w:rPr>
-        <w:t xml:space="preserve"> Dalam hal ini, metode inferensial dipilh menggunakan </w:t>
-      </w:r>
-      <w:r>
-        <w:rPr>
-          <w:lang w:val="sv-SE"/>
-        </w:rPr>
-        <w:t xml:space="preserve">ANOVA, </w:t>
-      </w:r>
-      <w:r>
-        <w:rPr>
+      </w:pPr>
+      <w:r>
+        <w:rPr>
+          <w:rFonts w:ascii="Times New Roman" w:hAnsi="Times New Roman" w:cs="Times New Roman"/>
           <w:i/>
           <w:iCs/>
           <w:lang w:val="sv-SE"/>
         </w:rPr>
-        <w:t>logistic regression</w:t>
-      </w:r>
-      <w:r>
-        <w:rPr>
+        <w:t>Distribusi Populasi</w:t>
+      </w:r>
+    </w:p>
+    <w:p>
+      <w:pPr>
+        <w:jc w:val="both"/>
+        <w:rPr>
+          <w:rFonts w:ascii="Times New Roman" w:hAnsi="Times New Roman" w:cs="Times New Roman"/>
+          <w:b/>
+          <w:bCs/>
+          <w:lang w:val="sv-SE"/>
+        </w:rPr>
+      </w:pPr>
+    </w:p>
+    <w:p>
+      <w:pPr>
+        <w:jc w:val="both"/>
+        <w:rPr>
+          <w:rFonts w:ascii="Times New Roman" w:hAnsi="Times New Roman" w:cs="Times New Roman"/>
           <w:i/>
           <w:iCs/>
           <w:lang w:val="sv-SE"/>
         </w:rPr>
-        <w:t>,</w:t>
-      </w:r>
-      <w:r>
-        <w:rPr>
+      </w:pPr>
+      <w:r>
+        <w:rPr>
+          <w:rFonts w:ascii="Times New Roman" w:hAnsi="Times New Roman" w:cs="Times New Roman"/>
           <w:i/>
           <w:iCs/>
           <w:lang w:val="sv-SE"/>
         </w:rPr>
-        <w:t xml:space="preserve"> </w:t>
-      </w:r>
-      <w:r>
-        <w:rPr>
-          <w:lang w:val="sv-SE"/>
-        </w:rPr>
-        <w:t xml:space="preserve">dan </w:t>
-      </w:r>
-      <w:r>
-        <w:rPr>
-          <w:lang w:val="sv-SE"/>
-        </w:rPr>
-        <w:t>estimasi OLS sederhana</w:t>
-      </w:r>
-      <w:r>
-        <w:rPr>
-          <w:lang w:val="sv-SE"/>
-        </w:rPr>
-        <w:t xml:space="preserve">. </w:t>
+        <w:t>Distribusi Perokok</w:t>
       </w:r>
     </w:p>
     <w:p>
       <w:pPr>
         <w:jc w:val="both"/>
         <w:rPr>
-          <w:b/>
-          <w:bCs/>
-          <w:lang w:val="sv-SE"/>
-        </w:rPr>
-      </w:pPr>
-      <w:r>
-        <w:rPr>
-          <w:b/>
-          <w:bCs/>
-          <w:lang w:val="sv-SE"/>
-        </w:rPr>
-        <w:t>Hasil</w:t>
-      </w:r>
-    </w:p>
-    <w:p>
-      <w:pPr>
-        <w:jc w:val="both"/>
-        <w:rPr>
+          <w:rFonts w:ascii="Times New Roman" w:hAnsi="Times New Roman" w:cs="Times New Roman"/>
           <w:b/>
           <w:bCs/>
           <w:lang w:val="sv-SE"/>
@@ -311,6 +623,95 @@
 <file path=word/numbering.xml><?xml version="1.0" encoding="utf-8"?>
 <w:numbering xmlns:wpc="http://schemas.microsoft.com/office/word/2010/wordprocessingCanvas" xmlns:cx="http://schemas.microsoft.com/office/drawing/2014/chartex" xmlns:cx1="http://schemas.microsoft.com/office/drawing/2015/9/8/chartex" xmlns:cx2="http://schemas.microsoft.com/office/drawing/2015/10/21/chartex" xmlns:cx3="http://schemas.microsoft.com/office/drawing/2016/5/9/chartex" xmlns:cx4="http://schemas.microsoft.com/office/drawing/2016/5/10/chartex" xmlns:cx5="http://schemas.microsoft.com/office/drawing/2016/5/11/chartex" xmlns:cx6="http://schemas.microsoft.com/office/drawing/2016/5/12/chartex" xmlns:cx7="http://schemas.microsoft.com/office/drawing/2016/5/13/chartex" xmlns:cx8="http://schemas.microsoft.com/office/drawing/2016/5/14/chartex" xmlns:mc="http://schemas.openxmlformats.org/markup-compatibility/2006" xmlns:aink="http://schemas.microsoft.com/office/drawing/2016/ink" xmlns:am3d="http://schemas.microsoft.com/office/drawing/2017/model3d" xmlns:o="urn:schemas-microsoft-com:office:office" xmlns:oel="http://schemas.microsoft.com/office/2019/extlst" xmlns:r="http://schemas.openxmlformats.org/officeDocument/2006/relationships" xmlns:m="http://schemas.openxmlformats.org/officeDocument/2006/math" xmlns:v="urn:schemas-microsoft-com:vml" xmlns:wp14="http://schemas.microsoft.com/office/word/2010/wordprocessingDrawing" xmlns:wp="http://schemas.openxmlformats.org/drawingml/2006/wordprocessingDrawing" xmlns:w10="urn:schemas-microsoft-com:office:word" xmlns:w="http://schemas.openxmlformats.org/wordprocessingml/2006/main" xmlns:w14="http://schemas.microsoft.com/office/word/2010/wordml" xmlns:w15="http://schemas.microsoft.com/office/word/2012/wordml" xmlns:w16cex="http://schemas.microsoft.com/office/word/2018/wordml/cex" xmlns:w16cid="http://schemas.microsoft.com/office/word/2016/wordml/cid" xmlns:w16="http://schemas.microsoft.com/office/word/2018/wordml" xmlns:w16du="http://schemas.microsoft.com/office/word/2023/wordml/word16du" xmlns:w16sdtdh="http://schemas.microsoft.com/office/word/2020/wordml/sdtdatahash" xmlns:w16sdtfl="http://schemas.microsoft.com/office/word/2024/wordml/sdtformatlock" xmlns:w16se="http://schemas.microsoft.com/office/word/2015/wordml/symex" xmlns:wpg="http://schemas.microsoft.com/office/word/2010/wordprocessingGroup" xmlns:wpi="http://schemas.microsoft.com/office/word/2010/wordprocessingInk" xmlns:wne="http://schemas.microsoft.com/office/word/2006/wordml" xmlns:wps="http://schemas.microsoft.com/office/word/2010/wordprocessingShape" mc:Ignorable="w14 w15 w16se w16cid w16 w16cex w16sdtdh w16sdtfl w16du wp14">
   <w:abstractNum w:abstractNumId="0" w15:restartNumberingAfterBreak="0">
+    <w:nsid w:val="123D6AFD"/>
+    <w:multiLevelType w:val="hybridMultilevel"/>
+    <w:tmpl w:val="69F2DB48"/>
+    <w:lvl w:ilvl="0" w:tplc="04090015">
+      <w:start w:val="1"/>
+      <w:numFmt w:val="upperLetter"/>
+      <w:lvlText w:val="%1."/>
+      <w:lvlJc w:val="left"/>
+      <w:pPr>
+        <w:ind w:left="720" w:hanging="360"/>
+      </w:pPr>
+      <w:rPr>
+        <w:rFonts w:hint="default"/>
+      </w:rPr>
+    </w:lvl>
+    <w:lvl w:ilvl="1" w:tplc="04090019" w:tentative="1">
+      <w:start w:val="1"/>
+      <w:numFmt w:val="lowerLetter"/>
+      <w:lvlText w:val="%2."/>
+      <w:lvlJc w:val="left"/>
+      <w:pPr>
+        <w:ind w:left="1440" w:hanging="360"/>
+      </w:pPr>
+    </w:lvl>
+    <w:lvl w:ilvl="2" w:tplc="0409001B" w:tentative="1">
+      <w:start w:val="1"/>
+      <w:numFmt w:val="lowerRoman"/>
+      <w:lvlText w:val="%3."/>
+      <w:lvlJc w:val="right"/>
+      <w:pPr>
+        <w:ind w:left="2160" w:hanging="180"/>
+      </w:pPr>
+    </w:lvl>
+    <w:lvl w:ilvl="3" w:tplc="0409000F" w:tentative="1">
+      <w:start w:val="1"/>
+      <w:numFmt w:val="decimal"/>
+      <w:lvlText w:val="%4."/>
+      <w:lvlJc w:val="left"/>
+      <w:pPr>
+        <w:ind w:left="2880" w:hanging="360"/>
+      </w:pPr>
+    </w:lvl>
+    <w:lvl w:ilvl="4" w:tplc="04090019" w:tentative="1">
+      <w:start w:val="1"/>
+      <w:numFmt w:val="lowerLetter"/>
+      <w:lvlText w:val="%5."/>
+      <w:lvlJc w:val="left"/>
+      <w:pPr>
+        <w:ind w:left="3600" w:hanging="360"/>
+      </w:pPr>
+    </w:lvl>
+    <w:lvl w:ilvl="5" w:tplc="0409001B" w:tentative="1">
+      <w:start w:val="1"/>
+      <w:numFmt w:val="lowerRoman"/>
+      <w:lvlText w:val="%6."/>
+      <w:lvlJc w:val="right"/>
+      <w:pPr>
+        <w:ind w:left="4320" w:hanging="180"/>
+      </w:pPr>
+    </w:lvl>
+    <w:lvl w:ilvl="6" w:tplc="0409000F" w:tentative="1">
+      <w:start w:val="1"/>
+      <w:numFmt w:val="decimal"/>
+      <w:lvlText w:val="%7."/>
+      <w:lvlJc w:val="left"/>
+      <w:pPr>
+        <w:ind w:left="5040" w:hanging="360"/>
+      </w:pPr>
+    </w:lvl>
+    <w:lvl w:ilvl="7" w:tplc="04090019" w:tentative="1">
+      <w:start w:val="1"/>
+      <w:numFmt w:val="lowerLetter"/>
+      <w:lvlText w:val="%8."/>
+      <w:lvlJc w:val="left"/>
+      <w:pPr>
+        <w:ind w:left="5760" w:hanging="360"/>
+      </w:pPr>
+    </w:lvl>
+    <w:lvl w:ilvl="8" w:tplc="0409001B" w:tentative="1">
+      <w:start w:val="1"/>
+      <w:numFmt w:val="lowerRoman"/>
+      <w:lvlText w:val="%9."/>
+      <w:lvlJc w:val="right"/>
+      <w:pPr>
+        <w:ind w:left="6480" w:hanging="180"/>
+      </w:pPr>
+    </w:lvl>
+  </w:abstractNum>
+  <w:abstractNum w:abstractNumId="1" w15:restartNumberingAfterBreak="0">
     <w:nsid w:val="13A84621"/>
     <w:multiLevelType w:val="hybridMultilevel"/>
     <w:tmpl w:val="3DE4C534"/>
@@ -423,7 +824,7 @@
       </w:rPr>
     </w:lvl>
   </w:abstractNum>
-  <w:abstractNum w:abstractNumId="1" w15:restartNumberingAfterBreak="0">
+  <w:abstractNum w:abstractNumId="2" w15:restartNumberingAfterBreak="0">
     <w:nsid w:val="401F3979"/>
     <w:multiLevelType w:val="hybridMultilevel"/>
     <w:tmpl w:val="F656EC16"/>
@@ -512,7 +913,208 @@
       </w:pPr>
     </w:lvl>
   </w:abstractNum>
-  <w:abstractNum w:abstractNumId="2" w15:restartNumberingAfterBreak="0">
+  <w:abstractNum w:abstractNumId="3" w15:restartNumberingAfterBreak="0">
+    <w:nsid w:val="41D2569F"/>
+    <w:multiLevelType w:val="hybridMultilevel"/>
+    <w:tmpl w:val="BB10D8A0"/>
+    <w:lvl w:ilvl="0" w:tplc="953477C2">
+      <w:numFmt w:val="bullet"/>
+      <w:lvlText w:val=""/>
+      <w:lvlJc w:val="left"/>
+      <w:pPr>
+        <w:ind w:left="720" w:hanging="360"/>
+      </w:pPr>
+      <w:rPr>
+        <w:rFonts w:ascii="Symbol" w:eastAsiaTheme="minorHAnsi" w:hAnsi="Symbol" w:cstheme="minorBidi" w:hint="default"/>
+      </w:rPr>
+    </w:lvl>
+    <w:lvl w:ilvl="1" w:tplc="04090003" w:tentative="1">
+      <w:start w:val="1"/>
+      <w:numFmt w:val="bullet"/>
+      <w:lvlText w:val="o"/>
+      <w:lvlJc w:val="left"/>
+      <w:pPr>
+        <w:ind w:left="1440" w:hanging="360"/>
+      </w:pPr>
+      <w:rPr>
+        <w:rFonts w:ascii="Courier New" w:hAnsi="Courier New" w:cs="Courier New" w:hint="default"/>
+      </w:rPr>
+    </w:lvl>
+    <w:lvl w:ilvl="2" w:tplc="04090005" w:tentative="1">
+      <w:start w:val="1"/>
+      <w:numFmt w:val="bullet"/>
+      <w:lvlText w:val=""/>
+      <w:lvlJc w:val="left"/>
+      <w:pPr>
+        <w:ind w:left="2160" w:hanging="360"/>
+      </w:pPr>
+      <w:rPr>
+        <w:rFonts w:ascii="Wingdings" w:hAnsi="Wingdings" w:hint="default"/>
+      </w:rPr>
+    </w:lvl>
+    <w:lvl w:ilvl="3" w:tplc="04090001" w:tentative="1">
+      <w:start w:val="1"/>
+      <w:numFmt w:val="bullet"/>
+      <w:lvlText w:val=""/>
+      <w:lvlJc w:val="left"/>
+      <w:pPr>
+        <w:ind w:left="2880" w:hanging="360"/>
+      </w:pPr>
+      <w:rPr>
+        <w:rFonts w:ascii="Symbol" w:hAnsi="Symbol" w:hint="default"/>
+      </w:rPr>
+    </w:lvl>
+    <w:lvl w:ilvl="4" w:tplc="04090003" w:tentative="1">
+      <w:start w:val="1"/>
+      <w:numFmt w:val="bullet"/>
+      <w:lvlText w:val="o"/>
+      <w:lvlJc w:val="left"/>
+      <w:pPr>
+        <w:ind w:left="3600" w:hanging="360"/>
+      </w:pPr>
+      <w:rPr>
+        <w:rFonts w:ascii="Courier New" w:hAnsi="Courier New" w:cs="Courier New" w:hint="default"/>
+      </w:rPr>
+    </w:lvl>
+    <w:lvl w:ilvl="5" w:tplc="04090005" w:tentative="1">
+      <w:start w:val="1"/>
+      <w:numFmt w:val="bullet"/>
+      <w:lvlText w:val=""/>
+      <w:lvlJc w:val="left"/>
+      <w:pPr>
+        <w:ind w:left="4320" w:hanging="360"/>
+      </w:pPr>
+      <w:rPr>
+        <w:rFonts w:ascii="Wingdings" w:hAnsi="Wingdings" w:hint="default"/>
+      </w:rPr>
+    </w:lvl>
+    <w:lvl w:ilvl="6" w:tplc="04090001" w:tentative="1">
+      <w:start w:val="1"/>
+      <w:numFmt w:val="bullet"/>
+      <w:lvlText w:val=""/>
+      <w:lvlJc w:val="left"/>
+      <w:pPr>
+        <w:ind w:left="5040" w:hanging="360"/>
+      </w:pPr>
+      <w:rPr>
+        <w:rFonts w:ascii="Symbol" w:hAnsi="Symbol" w:hint="default"/>
+      </w:rPr>
+    </w:lvl>
+    <w:lvl w:ilvl="7" w:tplc="04090003" w:tentative="1">
+      <w:start w:val="1"/>
+      <w:numFmt w:val="bullet"/>
+      <w:lvlText w:val="o"/>
+      <w:lvlJc w:val="left"/>
+      <w:pPr>
+        <w:ind w:left="5760" w:hanging="360"/>
+      </w:pPr>
+      <w:rPr>
+        <w:rFonts w:ascii="Courier New" w:hAnsi="Courier New" w:cs="Courier New" w:hint="default"/>
+      </w:rPr>
+    </w:lvl>
+    <w:lvl w:ilvl="8" w:tplc="04090005" w:tentative="1">
+      <w:start w:val="1"/>
+      <w:numFmt w:val="bullet"/>
+      <w:lvlText w:val=""/>
+      <w:lvlJc w:val="left"/>
+      <w:pPr>
+        <w:ind w:left="6480" w:hanging="360"/>
+      </w:pPr>
+      <w:rPr>
+        <w:rFonts w:ascii="Wingdings" w:hAnsi="Wingdings" w:hint="default"/>
+      </w:rPr>
+    </w:lvl>
+  </w:abstractNum>
+  <w:abstractNum w:abstractNumId="4" w15:restartNumberingAfterBreak="0">
+    <w:nsid w:val="4F070135"/>
+    <w:multiLevelType w:val="hybridMultilevel"/>
+    <w:tmpl w:val="7EE226AE"/>
+    <w:lvl w:ilvl="0" w:tplc="04090015">
+      <w:start w:val="1"/>
+      <w:numFmt w:val="upperLetter"/>
+      <w:lvlText w:val="%1."/>
+      <w:lvlJc w:val="left"/>
+      <w:pPr>
+        <w:ind w:left="720" w:hanging="360"/>
+      </w:pPr>
+      <w:rPr>
+        <w:rFonts w:hint="default"/>
+      </w:rPr>
+    </w:lvl>
+    <w:lvl w:ilvl="1" w:tplc="04090019" w:tentative="1">
+      <w:start w:val="1"/>
+      <w:numFmt w:val="lowerLetter"/>
+      <w:lvlText w:val="%2."/>
+      <w:lvlJc w:val="left"/>
+      <w:pPr>
+        <w:ind w:left="1440" w:hanging="360"/>
+      </w:pPr>
+    </w:lvl>
+    <w:lvl w:ilvl="2" w:tplc="0409001B" w:tentative="1">
+      <w:start w:val="1"/>
+      <w:numFmt w:val="lowerRoman"/>
+      <w:lvlText w:val="%3."/>
+      <w:lvlJc w:val="right"/>
+      <w:pPr>
+        <w:ind w:left="2160" w:hanging="180"/>
+      </w:pPr>
+    </w:lvl>
+    <w:lvl w:ilvl="3" w:tplc="0409000F" w:tentative="1">
+      <w:start w:val="1"/>
+      <w:numFmt w:val="decimal"/>
+      <w:lvlText w:val="%4."/>
+      <w:lvlJc w:val="left"/>
+      <w:pPr>
+        <w:ind w:left="2880" w:hanging="360"/>
+      </w:pPr>
+    </w:lvl>
+    <w:lvl w:ilvl="4" w:tplc="04090019" w:tentative="1">
+      <w:start w:val="1"/>
+      <w:numFmt w:val="lowerLetter"/>
+      <w:lvlText w:val="%5."/>
+      <w:lvlJc w:val="left"/>
+      <w:pPr>
+        <w:ind w:left="3600" w:hanging="360"/>
+      </w:pPr>
+    </w:lvl>
+    <w:lvl w:ilvl="5" w:tplc="0409001B" w:tentative="1">
+      <w:start w:val="1"/>
+      <w:numFmt w:val="lowerRoman"/>
+      <w:lvlText w:val="%6."/>
+      <w:lvlJc w:val="right"/>
+      <w:pPr>
+        <w:ind w:left="4320" w:hanging="180"/>
+      </w:pPr>
+    </w:lvl>
+    <w:lvl w:ilvl="6" w:tplc="0409000F" w:tentative="1">
+      <w:start w:val="1"/>
+      <w:numFmt w:val="decimal"/>
+      <w:lvlText w:val="%7."/>
+      <w:lvlJc w:val="left"/>
+      <w:pPr>
+        <w:ind w:left="5040" w:hanging="360"/>
+      </w:pPr>
+    </w:lvl>
+    <w:lvl w:ilvl="7" w:tplc="04090019" w:tentative="1">
+      <w:start w:val="1"/>
+      <w:numFmt w:val="lowerLetter"/>
+      <w:lvlText w:val="%8."/>
+      <w:lvlJc w:val="left"/>
+      <w:pPr>
+        <w:ind w:left="5760" w:hanging="360"/>
+      </w:pPr>
+    </w:lvl>
+    <w:lvl w:ilvl="8" w:tplc="0409001B" w:tentative="1">
+      <w:start w:val="1"/>
+      <w:numFmt w:val="lowerRoman"/>
+      <w:lvlText w:val="%9."/>
+      <w:lvlJc w:val="right"/>
+      <w:pPr>
+        <w:ind w:left="6480" w:hanging="180"/>
+      </w:pPr>
+    </w:lvl>
+  </w:abstractNum>
+  <w:abstractNum w:abstractNumId="5" w15:restartNumberingAfterBreak="0">
     <w:nsid w:val="64236861"/>
     <w:multiLevelType w:val="hybridMultilevel"/>
     <w:tmpl w:val="5DB69D60"/>
@@ -602,13 +1204,22 @@
     </w:lvl>
   </w:abstractNum>
   <w:num w:numId="1" w16cid:durableId="316305194">
+    <w:abstractNumId w:val="2"/>
+  </w:num>
+  <w:num w:numId="2" w16cid:durableId="399062637">
     <w:abstractNumId w:val="1"/>
   </w:num>
-  <w:num w:numId="2" w16cid:durableId="399062637">
+  <w:num w:numId="3" w16cid:durableId="1418985796">
+    <w:abstractNumId w:val="5"/>
+  </w:num>
+  <w:num w:numId="4" w16cid:durableId="2009553030">
+    <w:abstractNumId w:val="3"/>
+  </w:num>
+  <w:num w:numId="5" w16cid:durableId="815344767">
+    <w:abstractNumId w:val="4"/>
+  </w:num>
+  <w:num w:numId="6" w16cid:durableId="1870339324">
     <w:abstractNumId w:val="0"/>
-  </w:num>
-  <w:num w:numId="3" w16cid:durableId="1418985796">
-    <w:abstractNumId w:val="2"/>
   </w:num>
 </w:numbering>
 </file>

</xml_diff>

<commit_message>
finishing EDA & Add map viz
</commit_message>
<xml_diff>
--- a/Output/Report.docx
+++ b/Output/Report.docx
@@ -99,9 +99,29 @@
       <w:pPr>
         <w:rPr>
           <w:rFonts w:ascii="Times New Roman" w:hAnsi="Times New Roman" w:cs="Times New Roman"/>
-          <w:lang w:val="sv-SE"/>
-        </w:rPr>
-      </w:pPr>
+        </w:rPr>
+      </w:pPr>
+      <w:r>
+        <w:rPr>
+          <w:rFonts w:ascii="Times New Roman" w:hAnsi="Times New Roman" w:cs="Times New Roman"/>
+        </w:rPr>
+        <w:t>All scripts are available o</w:t>
+      </w:r>
+      <w:r>
+        <w:rPr>
+          <w:rFonts w:ascii="Times New Roman" w:hAnsi="Times New Roman" w:cs="Times New Roman"/>
+        </w:rPr>
+        <w:t xml:space="preserve">n this </w:t>
+      </w:r>
+      <w:hyperlink r:id="rId6" w:history="1">
+        <w:r>
+          <w:rPr>
+            <w:rStyle w:val="Hyperlink"/>
+            <w:rFonts w:ascii="Times New Roman" w:hAnsi="Times New Roman" w:cs="Times New Roman"/>
+          </w:rPr>
+          <w:t>repository</w:t>
+        </w:r>
+      </w:hyperlink>
     </w:p>
     <w:p>
       <w:pPr>
@@ -586,6 +606,13 @@
           <w:lang w:val="sv-SE"/>
         </w:rPr>
         <w:t>Berikut ini merupakan visualisasi berdasarkan data SUSENAS 2023 dan SKI 2023 pada penduduk usia 10-75 tahun</w:t>
+      </w:r>
+      <w:r>
+        <w:rPr>
+          <w:rFonts w:ascii="Times New Roman" w:hAnsi="Times New Roman" w:cs="Times New Roman"/>
+          <w:lang w:val="sv-SE"/>
+        </w:rPr>
+        <w:t>:</w:t>
       </w:r>
     </w:p>
     <w:p>
@@ -748,7 +775,7 @@
                     <pic:cNvPicPr/>
                   </pic:nvPicPr>
                   <pic:blipFill>
-                    <a:blip r:embed="rId6"/>
+                    <a:blip r:embed="rId7"/>
                     <a:stretch>
                       <a:fillRect/>
                     </a:stretch>
@@ -817,7 +844,14 @@
           <w:rFonts w:ascii="Times New Roman" w:hAnsi="Times New Roman" w:cs="Times New Roman"/>
           <w:lang w:val="sv-SE"/>
         </w:rPr>
-        <w:t>tangga (dalam kurung)</w:t>
+        <w:t xml:space="preserve">tangga </w:t>
+      </w:r>
+      <w:r>
+        <w:rPr>
+          <w:rFonts w:ascii="Times New Roman" w:hAnsi="Times New Roman" w:cs="Times New Roman"/>
+          <w:lang w:val="sv-SE"/>
+        </w:rPr>
+        <w:t>berusia 10-75 tahun</w:t>
       </w:r>
     </w:p>
     <w:p>
@@ -850,7 +884,7 @@
                     <pic:cNvPicPr/>
                   </pic:nvPicPr>
                   <pic:blipFill>
-                    <a:blip r:embed="rId7"/>
+                    <a:blip r:embed="rId8"/>
                     <a:stretch>
                       <a:fillRect/>
                     </a:stretch>
@@ -967,7 +1001,7 @@
                     <pic:cNvPicPr/>
                   </pic:nvPicPr>
                   <pic:blipFill>
-                    <a:blip r:embed="rId8"/>
+                    <a:blip r:embed="rId9"/>
                     <a:stretch>
                       <a:fillRect/>
                     </a:stretch>
@@ -1049,9 +1083,9 @@
           <w:lang w:val="sv-SE"/>
         </w:rPr>
         <w:drawing>
-          <wp:inline distT="0" distB="0" distL="0" distR="0" wp14:anchorId="48866E1E" wp14:editId="25FB7DD4">
-            <wp:extent cx="3975652" cy="4422913"/>
-            <wp:effectExtent l="0" t="0" r="6350" b="0"/>
+          <wp:inline distT="0" distB="0" distL="0" distR="0" wp14:anchorId="48866E1E" wp14:editId="2F8B75AA">
+            <wp:extent cx="2748486" cy="3057690"/>
+            <wp:effectExtent l="0" t="0" r="0" b="0"/>
             <wp:docPr id="484746908" name="Picture 1"/>
             <wp:cNvGraphicFramePr>
               <a:graphicFrameLocks xmlns:a="http://schemas.openxmlformats.org/drawingml/2006/main" noChangeAspect="1"/>
@@ -1064,7 +1098,7 @@
                     <pic:cNvPicPr/>
                   </pic:nvPicPr>
                   <pic:blipFill>
-                    <a:blip r:embed="rId9"/>
+                    <a:blip r:embed="rId10"/>
                     <a:stretch>
                       <a:fillRect/>
                     </a:stretch>
@@ -1072,7 +1106,7 @@
                   <pic:spPr>
                     <a:xfrm>
                       <a:off x="0" y="0"/>
-                      <a:ext cx="3980573" cy="4428387"/>
+                      <a:ext cx="2758966" cy="3069349"/>
                     </a:xfrm>
                     <a:prstGeom prst="rect">
                       <a:avLst/>
@@ -1173,9 +1207,9 @@
         </w:rPr>
         <w:lastRenderedPageBreak/>
         <w:drawing>
-          <wp:inline distT="0" distB="0" distL="0" distR="0" wp14:anchorId="1F97CDAD" wp14:editId="2E7830D6">
-            <wp:extent cx="3665551" cy="5029167"/>
-            <wp:effectExtent l="0" t="0" r="0" b="635"/>
+          <wp:inline distT="0" distB="0" distL="0" distR="0" wp14:anchorId="1F97CDAD" wp14:editId="5C7DE1D9">
+            <wp:extent cx="2642774" cy="3625908"/>
+            <wp:effectExtent l="0" t="0" r="5715" b="0"/>
             <wp:docPr id="1855022957" name="Picture 1"/>
             <wp:cNvGraphicFramePr>
               <a:graphicFrameLocks xmlns:a="http://schemas.openxmlformats.org/drawingml/2006/main" noChangeAspect="1"/>
@@ -1188,7 +1222,7 @@
                     <pic:cNvPicPr/>
                   </pic:nvPicPr>
                   <pic:blipFill>
-                    <a:blip r:embed="rId10"/>
+                    <a:blip r:embed="rId11"/>
                     <a:stretch>
                       <a:fillRect/>
                     </a:stretch>
@@ -1196,7 +1230,7 @@
                   <pic:spPr>
                     <a:xfrm>
                       <a:off x="0" y="0"/>
-                      <a:ext cx="3679837" cy="5048767"/>
+                      <a:ext cx="2657300" cy="3645838"/>
                     </a:xfrm>
                     <a:prstGeom prst="rect">
                       <a:avLst/>
@@ -1294,27 +1328,15 @@
           <w:lang w:val="sv-SE"/>
         </w:rPr>
       </w:pPr>
-    </w:p>
-    <w:p>
-      <w:pPr>
-        <w:tabs>
-          <w:tab w:val="left" w:pos="6852"/>
-        </w:tabs>
-        <w:jc w:val="center"/>
-        <w:rPr>
-          <w:rFonts w:ascii="Times New Roman" w:hAnsi="Times New Roman" w:cs="Times New Roman"/>
-          <w:lang w:val="sv-SE"/>
-        </w:rPr>
-      </w:pPr>
-      <w:r>
-        <w:rPr>
-          <w:rFonts w:ascii="Times New Roman" w:hAnsi="Times New Roman" w:cs="Times New Roman"/>
-          <w:lang w:val="sv-SE"/>
-        </w:rPr>
-        <w:lastRenderedPageBreak/>
+      <w:r>
+        <w:rPr>
+          <w:rFonts w:ascii="Times New Roman" w:hAnsi="Times New Roman" w:cs="Times New Roman"/>
+          <w:noProof/>
+          <w:lang w:val="sv-SE"/>
+        </w:rPr>
         <w:drawing>
-          <wp:inline distT="0" distB="0" distL="0" distR="0" wp14:anchorId="0068EB42" wp14:editId="16C3DB6E">
-            <wp:extent cx="3071813" cy="2737064"/>
+          <wp:inline distT="0" distB="0" distL="0" distR="0" wp14:anchorId="0068EB42" wp14:editId="7E5E665D">
+            <wp:extent cx="2515922" cy="2241751"/>
             <wp:effectExtent l="0" t="0" r="0" b="6350"/>
             <wp:docPr id="1485961723" name="Picture 1"/>
             <wp:cNvGraphicFramePr>
@@ -1328,7 +1350,7 @@
                     <pic:cNvPicPr/>
                   </pic:nvPicPr>
                   <pic:blipFill rotWithShape="1">
-                    <a:blip r:embed="rId11"/>
+                    <a:blip r:embed="rId12"/>
                     <a:srcRect b="915"/>
                     <a:stretch>
                       <a:fillRect/>
@@ -1337,7 +1359,7 @@
                   <pic:spPr bwMode="auto">
                     <a:xfrm>
                       <a:off x="0" y="0"/>
-                      <a:ext cx="3078870" cy="2743352"/>
+                      <a:ext cx="2524932" cy="2249779"/>
                     </a:xfrm>
                     <a:prstGeom prst="rect">
                       <a:avLst/>
@@ -1441,10 +1463,11 @@
           <w:noProof/>
           <w:lang w:val="sv-SE"/>
         </w:rPr>
+        <w:lastRenderedPageBreak/>
         <w:drawing>
-          <wp:inline distT="0" distB="0" distL="0" distR="0" wp14:anchorId="7DCD83E8" wp14:editId="710E0D8A">
-            <wp:extent cx="4424005" cy="2930903"/>
-            <wp:effectExtent l="0" t="0" r="0" b="3175"/>
+          <wp:inline distT="0" distB="0" distL="0" distR="0" wp14:anchorId="7DCD83E8" wp14:editId="2CEEA877">
+            <wp:extent cx="3287612" cy="2178043"/>
+            <wp:effectExtent l="0" t="0" r="8255" b="0"/>
             <wp:docPr id="625433068" name="Picture 1"/>
             <wp:cNvGraphicFramePr>
               <a:graphicFrameLocks xmlns:a="http://schemas.openxmlformats.org/drawingml/2006/main" noChangeAspect="1"/>
@@ -1457,7 +1480,7 @@
                     <pic:cNvPicPr/>
                   </pic:nvPicPr>
                   <pic:blipFill>
-                    <a:blip r:embed="rId12"/>
+                    <a:blip r:embed="rId13"/>
                     <a:stretch>
                       <a:fillRect/>
                     </a:stretch>
@@ -1465,7 +1488,7 @@
                   <pic:spPr>
                     <a:xfrm>
                       <a:off x="0" y="0"/>
-                      <a:ext cx="4430492" cy="2935201"/>
+                      <a:ext cx="3306602" cy="2190624"/>
                     </a:xfrm>
                     <a:prstGeom prst="rect">
                       <a:avLst/>
@@ -1480,23 +1503,68 @@
     </w:p>
     <w:p>
       <w:pPr>
+        <w:jc w:val="center"/>
+        <w:rPr>
+          <w:rFonts w:ascii="Times New Roman" w:hAnsi="Times New Roman" w:cs="Times New Roman"/>
+          <w:lang w:val="sv-SE"/>
+        </w:rPr>
+      </w:pPr>
+    </w:p>
+    <w:p>
+      <w:pPr>
         <w:tabs>
           <w:tab w:val="left" w:pos="6852"/>
         </w:tabs>
         <w:jc w:val="center"/>
         <w:rPr>
           <w:rFonts w:ascii="Times New Roman" w:hAnsi="Times New Roman" w:cs="Times New Roman"/>
-          <w:b/>
-          <w:bCs/>
-          <w:lang w:val="sv-SE"/>
-        </w:rPr>
-      </w:pPr>
-    </w:p>
-    <w:p>
-      <w:pPr>
-        <w:tabs>
-          <w:tab w:val="left" w:pos="6852"/>
-        </w:tabs>
+          <w:lang w:val="sv-SE"/>
+        </w:rPr>
+      </w:pPr>
+      <w:r>
+        <w:rPr>
+          <w:rFonts w:ascii="Times New Roman" w:hAnsi="Times New Roman" w:cs="Times New Roman"/>
+          <w:b/>
+          <w:bCs/>
+          <w:lang w:val="sv-SE"/>
+        </w:rPr>
+        <w:t>Gambar 1.</w:t>
+      </w:r>
+      <w:r>
+        <w:rPr>
+          <w:rFonts w:ascii="Times New Roman" w:hAnsi="Times New Roman" w:cs="Times New Roman"/>
+          <w:b/>
+          <w:bCs/>
+          <w:lang w:val="sv-SE"/>
+        </w:rPr>
+        <w:t>2</w:t>
+      </w:r>
+      <w:r>
+        <w:rPr>
+          <w:rFonts w:ascii="Times New Roman" w:hAnsi="Times New Roman" w:cs="Times New Roman"/>
+          <w:b/>
+          <w:bCs/>
+          <w:lang w:val="sv-SE"/>
+        </w:rPr>
+        <w:t>.</w:t>
+      </w:r>
+      <w:r>
+        <w:rPr>
+          <w:rFonts w:ascii="Times New Roman" w:hAnsi="Times New Roman" w:cs="Times New Roman"/>
+          <w:lang w:val="sv-SE"/>
+        </w:rPr>
+        <w:t xml:space="preserve"> </w:t>
+      </w:r>
+      <w:r>
+        <w:rPr>
+          <w:rFonts w:ascii="Times New Roman" w:hAnsi="Times New Roman" w:cs="Times New Roman"/>
+          <w:lang w:val="sv-SE"/>
+        </w:rPr>
+        <w:t>Distribusi populasi penduduk per kabupaten/kota</w:t>
+      </w:r>
+    </w:p>
+    <w:p>
+      <w:pPr>
         <w:jc w:val="center"/>
         <w:rPr>
           <w:rFonts w:ascii="Times New Roman" w:hAnsi="Times New Roman" w:cs="Times New Roman"/>
@@ -1506,68 +1574,9 @@
       <w:r>
         <w:rPr>
           <w:rFonts w:ascii="Times New Roman" w:hAnsi="Times New Roman" w:cs="Times New Roman"/>
-          <w:b/>
-          <w:bCs/>
-          <w:lang w:val="sv-SE"/>
-        </w:rPr>
-        <w:t xml:space="preserve">Gambar </w:t>
-      </w:r>
-      <w:r>
-        <w:rPr>
-          <w:rFonts w:ascii="Times New Roman" w:hAnsi="Times New Roman" w:cs="Times New Roman"/>
-          <w:b/>
-          <w:bCs/>
-          <w:lang w:val="sv-SE"/>
-        </w:rPr>
-        <w:t>1.</w:t>
-      </w:r>
-      <w:r>
-        <w:rPr>
-          <w:rFonts w:ascii="Times New Roman" w:hAnsi="Times New Roman" w:cs="Times New Roman"/>
-          <w:b/>
-          <w:bCs/>
-          <w:lang w:val="sv-SE"/>
-        </w:rPr>
-        <w:t>2</w:t>
-      </w:r>
-      <w:r>
-        <w:rPr>
-          <w:rFonts w:ascii="Times New Roman" w:hAnsi="Times New Roman" w:cs="Times New Roman"/>
-          <w:b/>
-          <w:bCs/>
-          <w:lang w:val="sv-SE"/>
-        </w:rPr>
-        <w:t>.</w:t>
-      </w:r>
-      <w:r>
-        <w:rPr>
-          <w:rFonts w:ascii="Times New Roman" w:hAnsi="Times New Roman" w:cs="Times New Roman"/>
-          <w:lang w:val="sv-SE"/>
-        </w:rPr>
-        <w:t xml:space="preserve"> </w:t>
-      </w:r>
-      <w:r>
-        <w:rPr>
-          <w:rFonts w:ascii="Times New Roman" w:hAnsi="Times New Roman" w:cs="Times New Roman"/>
-          <w:lang w:val="sv-SE"/>
-        </w:rPr>
-        <w:t>Distribusi populasi penduduk per kabupaten/kota</w:t>
-      </w:r>
-    </w:p>
-    <w:p>
-      <w:pPr>
-        <w:jc w:val="center"/>
-        <w:rPr>
-          <w:rFonts w:ascii="Times New Roman" w:hAnsi="Times New Roman" w:cs="Times New Roman"/>
-          <w:lang w:val="sv-SE"/>
-        </w:rPr>
-      </w:pPr>
-      <w:r>
-        <w:rPr>
-          <w:rFonts w:ascii="Times New Roman" w:hAnsi="Times New Roman" w:cs="Times New Roman"/>
-          <w:lang w:val="sv-SE"/>
-        </w:rPr>
-        <w:lastRenderedPageBreak/>
+          <w:noProof/>
+          <w:lang w:val="sv-SE"/>
+        </w:rPr>
         <w:drawing>
           <wp:inline distT="0" distB="0" distL="0" distR="0" wp14:anchorId="420E6563" wp14:editId="3413F6D4">
             <wp:extent cx="3414465" cy="3093447"/>
@@ -1584,7 +1593,7 @@
                     <pic:cNvPicPr/>
                   </pic:nvPicPr>
                   <pic:blipFill>
-                    <a:blip r:embed="rId13"/>
+                    <a:blip r:embed="rId14"/>
                     <a:stretch>
                       <a:fillRect/>
                     </a:stretch>
@@ -1713,7 +1722,7 @@
                     <pic:cNvPicPr/>
                   </pic:nvPicPr>
                   <pic:blipFill>
-                    <a:blip r:embed="rId14"/>
+                    <a:blip r:embed="rId15"/>
                     <a:stretch>
                       <a:fillRect/>
                     </a:stretch>
@@ -1876,7 +1885,7 @@
                     <pic:cNvPicPr/>
                   </pic:nvPicPr>
                   <pic:blipFill>
-                    <a:blip r:embed="rId15"/>
+                    <a:blip r:embed="rId16"/>
                     <a:stretch>
                       <a:fillRect/>
                     </a:stretch>
@@ -1899,9 +1908,249 @@
     </w:p>
     <w:p>
       <w:pPr>
+        <w:tabs>
+          <w:tab w:val="left" w:pos="6852"/>
+        </w:tabs>
         <w:jc w:val="center"/>
         <w:rPr>
           <w:rFonts w:ascii="Times New Roman" w:hAnsi="Times New Roman" w:cs="Times New Roman"/>
+          <w:lang w:val="sv-SE"/>
+        </w:rPr>
+      </w:pPr>
+      <w:r>
+        <w:rPr>
+          <w:rFonts w:ascii="Times New Roman" w:hAnsi="Times New Roman" w:cs="Times New Roman"/>
+          <w:b/>
+          <w:bCs/>
+          <w:lang w:val="sv-SE"/>
+        </w:rPr>
+        <w:t>Gambar 1.2</w:t>
+      </w:r>
+      <w:r>
+        <w:rPr>
+          <w:rFonts w:ascii="Times New Roman" w:hAnsi="Times New Roman" w:cs="Times New Roman"/>
+          <w:b/>
+          <w:bCs/>
+          <w:lang w:val="sv-SE"/>
+        </w:rPr>
+        <w:t>.</w:t>
+      </w:r>
+      <w:r>
+        <w:rPr>
+          <w:rFonts w:ascii="Times New Roman" w:hAnsi="Times New Roman" w:cs="Times New Roman"/>
+          <w:lang w:val="sv-SE"/>
+        </w:rPr>
+        <w:t xml:space="preserve"> </w:t>
+      </w:r>
+      <w:r>
+        <w:rPr>
+          <w:rFonts w:ascii="Times New Roman" w:hAnsi="Times New Roman" w:cs="Times New Roman"/>
+          <w:lang w:val="sv-SE"/>
+        </w:rPr>
+        <w:t xml:space="preserve">Distribusi </w:t>
+      </w:r>
+      <w:r>
+        <w:rPr>
+          <w:rFonts w:ascii="Times New Roman" w:hAnsi="Times New Roman" w:cs="Times New Roman"/>
+          <w:lang w:val="sv-SE"/>
+        </w:rPr>
+        <w:t>rasio prevalensi merokok berdasarkan provinsi</w:t>
+      </w:r>
+    </w:p>
+    <w:tbl>
+      <w:tblPr>
+        <w:tblStyle w:val="TableGrid"/>
+        <w:tblW w:w="11430" w:type="dxa"/>
+        <w:tblInd w:w="-1085" w:type="dxa"/>
+        <w:tblBorders>
+          <w:top w:val="none" w:sz="0" w:space="0" w:color="auto"/>
+          <w:left w:val="none" w:sz="0" w:space="0" w:color="auto"/>
+          <w:bottom w:val="none" w:sz="0" w:space="0" w:color="auto"/>
+          <w:right w:val="none" w:sz="0" w:space="0" w:color="auto"/>
+          <w:insideH w:val="none" w:sz="0" w:space="0" w:color="auto"/>
+          <w:insideV w:val="none" w:sz="0" w:space="0" w:color="auto"/>
+        </w:tblBorders>
+        <w:tblLook w:val="04A0" w:firstRow="1" w:lastRow="0" w:firstColumn="1" w:lastColumn="0" w:noHBand="0" w:noVBand="1"/>
+      </w:tblPr>
+      <w:tblGrid>
+        <w:gridCol w:w="5706"/>
+        <w:gridCol w:w="5724"/>
+      </w:tblGrid>
+      <w:tr>
+        <w:tc>
+          <w:tcPr>
+            <w:tcW w:w="5706" w:type="dxa"/>
+          </w:tcPr>
+          <w:p>
+            <w:pPr>
+              <w:jc w:val="center"/>
+              <w:rPr>
+                <w:rFonts w:ascii="Times New Roman" w:hAnsi="Times New Roman" w:cs="Times New Roman"/>
+                <w:lang w:val="sv-SE"/>
+              </w:rPr>
+            </w:pPr>
+            <w:r>
+              <w:rPr>
+                <w:rFonts w:ascii="Times New Roman" w:hAnsi="Times New Roman" w:cs="Times New Roman"/>
+                <w:lang w:val="sv-SE"/>
+              </w:rPr>
+              <w:drawing>
+                <wp:inline distT="0" distB="0" distL="0" distR="0" wp14:anchorId="3E25F299" wp14:editId="50D8AC40">
+                  <wp:extent cx="3479677" cy="2040222"/>
+                  <wp:effectExtent l="0" t="0" r="6985" b="0"/>
+                  <wp:docPr id="254072283" name="Picture 1"/>
+                  <wp:cNvGraphicFramePr>
+                    <a:graphicFrameLocks xmlns:a="http://schemas.openxmlformats.org/drawingml/2006/main" noChangeAspect="1"/>
+                  </wp:cNvGraphicFramePr>
+                  <a:graphic xmlns:a="http://schemas.openxmlformats.org/drawingml/2006/main">
+                    <a:graphicData uri="http://schemas.openxmlformats.org/drawingml/2006/picture">
+                      <pic:pic xmlns:pic="http://schemas.openxmlformats.org/drawingml/2006/picture">
+                        <pic:nvPicPr>
+                          <pic:cNvPr id="254072283" name=""/>
+                          <pic:cNvPicPr/>
+                        </pic:nvPicPr>
+                        <pic:blipFill>
+                          <a:blip r:embed="rId17"/>
+                          <a:stretch>
+                            <a:fillRect/>
+                          </a:stretch>
+                        </pic:blipFill>
+                        <pic:spPr>
+                          <a:xfrm>
+                            <a:off x="0" y="0"/>
+                            <a:ext cx="3510814" cy="2058478"/>
+                          </a:xfrm>
+                          <a:prstGeom prst="rect">
+                            <a:avLst/>
+                          </a:prstGeom>
+                        </pic:spPr>
+                      </pic:pic>
+                    </a:graphicData>
+                  </a:graphic>
+                </wp:inline>
+              </w:drawing>
+            </w:r>
+          </w:p>
+        </w:tc>
+        <w:tc>
+          <w:tcPr>
+            <w:tcW w:w="5724" w:type="dxa"/>
+          </w:tcPr>
+          <w:p>
+            <w:pPr>
+              <w:jc w:val="center"/>
+              <w:rPr>
+                <w:rFonts w:ascii="Times New Roman" w:hAnsi="Times New Roman" w:cs="Times New Roman"/>
+                <w:lang w:val="sv-SE"/>
+              </w:rPr>
+            </w:pPr>
+            <w:r>
+              <w:rPr>
+                <w:rFonts w:ascii="Times New Roman" w:hAnsi="Times New Roman" w:cs="Times New Roman"/>
+                <w:lang w:val="sv-SE"/>
+              </w:rPr>
+              <w:drawing>
+                <wp:inline distT="0" distB="0" distL="0" distR="0" wp14:anchorId="2354F6D5" wp14:editId="0D8E0C38">
+                  <wp:extent cx="3426039" cy="2077221"/>
+                  <wp:effectExtent l="0" t="0" r="3175" b="0"/>
+                  <wp:docPr id="1321923569" name="Picture 1"/>
+                  <wp:cNvGraphicFramePr>
+                    <a:graphicFrameLocks xmlns:a="http://schemas.openxmlformats.org/drawingml/2006/main" noChangeAspect="1"/>
+                  </wp:cNvGraphicFramePr>
+                  <a:graphic xmlns:a="http://schemas.openxmlformats.org/drawingml/2006/main">
+                    <a:graphicData uri="http://schemas.openxmlformats.org/drawingml/2006/picture">
+                      <pic:pic xmlns:pic="http://schemas.openxmlformats.org/drawingml/2006/picture">
+                        <pic:nvPicPr>
+                          <pic:cNvPr id="1321923569" name=""/>
+                          <pic:cNvPicPr/>
+                        </pic:nvPicPr>
+                        <pic:blipFill>
+                          <a:blip r:embed="rId18"/>
+                          <a:stretch>
+                            <a:fillRect/>
+                          </a:stretch>
+                        </pic:blipFill>
+                        <pic:spPr>
+                          <a:xfrm>
+                            <a:off x="0" y="0"/>
+                            <a:ext cx="3474478" cy="2106590"/>
+                          </a:xfrm>
+                          <a:prstGeom prst="rect">
+                            <a:avLst/>
+                          </a:prstGeom>
+                        </pic:spPr>
+                      </pic:pic>
+                    </a:graphicData>
+                  </a:graphic>
+                </wp:inline>
+              </w:drawing>
+            </w:r>
+          </w:p>
+        </w:tc>
+      </w:tr>
+      <w:tr>
+        <w:tc>
+          <w:tcPr>
+            <w:tcW w:w="11430" w:type="dxa"/>
+            <w:gridSpan w:val="2"/>
+          </w:tcPr>
+          <w:p>
+            <w:pPr>
+              <w:jc w:val="center"/>
+              <w:rPr>
+                <w:rFonts w:ascii="Times New Roman" w:hAnsi="Times New Roman" w:cs="Times New Roman"/>
+                <w:lang w:val="sv-SE"/>
+              </w:rPr>
+            </w:pPr>
+            <w:r>
+              <w:rPr>
+                <w:rFonts w:ascii="Times New Roman" w:hAnsi="Times New Roman" w:cs="Times New Roman"/>
+                <w:lang w:val="sv-SE"/>
+              </w:rPr>
+              <w:drawing>
+                <wp:inline distT="0" distB="0" distL="0" distR="0" wp14:anchorId="1D7774B9" wp14:editId="0AC58F6A">
+                  <wp:extent cx="3703333" cy="2267501"/>
+                  <wp:effectExtent l="0" t="0" r="0" b="0"/>
+                  <wp:docPr id="796741883" name="Picture 1"/>
+                  <wp:cNvGraphicFramePr>
+                    <a:graphicFrameLocks xmlns:a="http://schemas.openxmlformats.org/drawingml/2006/main" noChangeAspect="1"/>
+                  </wp:cNvGraphicFramePr>
+                  <a:graphic xmlns:a="http://schemas.openxmlformats.org/drawingml/2006/main">
+                    <a:graphicData uri="http://schemas.openxmlformats.org/drawingml/2006/picture">
+                      <pic:pic xmlns:pic="http://schemas.openxmlformats.org/drawingml/2006/picture">
+                        <pic:nvPicPr>
+                          <pic:cNvPr id="796741883" name=""/>
+                          <pic:cNvPicPr/>
+                        </pic:nvPicPr>
+                        <pic:blipFill>
+                          <a:blip r:embed="rId19"/>
+                          <a:stretch>
+                            <a:fillRect/>
+                          </a:stretch>
+                        </pic:blipFill>
+                        <pic:spPr>
+                          <a:xfrm>
+                            <a:off x="0" y="0"/>
+                            <a:ext cx="3716575" cy="2275609"/>
+                          </a:xfrm>
+                          <a:prstGeom prst="rect">
+                            <a:avLst/>
+                          </a:prstGeom>
+                        </pic:spPr>
+                      </pic:pic>
+                    </a:graphicData>
+                  </a:graphic>
+                </wp:inline>
+              </w:drawing>
+            </w:r>
+          </w:p>
+        </w:tc>
+      </w:tr>
+    </w:tbl>
+    <w:p>
+      <w:pPr>
+        <w:rPr>
+          <w:rFonts w:ascii="Times New Roman" w:hAnsi="Times New Roman" w:cs="Times New Roman"/>
           <w:b/>
           <w:bCs/>
           <w:lang w:val="sv-SE"/>
@@ -1964,7 +2213,7 @@
           <w:rFonts w:ascii="Times New Roman" w:hAnsi="Times New Roman" w:cs="Times New Roman"/>
           <w:lang w:val="sv-SE"/>
         </w:rPr>
-        <w:t xml:space="preserve"> berdasarkan klaisifikasi </w:t>
+        <w:t xml:space="preserve"> berdasarkan klasifikasi </w:t>
       </w:r>
       <w:r>
         <w:rPr>
@@ -1992,10 +2241,11 @@
           <w:noProof/>
           <w:lang w:val="sv-SE"/>
         </w:rPr>
+        <w:lastRenderedPageBreak/>
         <w:drawing>
-          <wp:inline distT="0" distB="0" distL="0" distR="0" wp14:anchorId="47BF5303" wp14:editId="031FD885">
-            <wp:extent cx="4244738" cy="3380825"/>
-            <wp:effectExtent l="0" t="0" r="3810" b="0"/>
+          <wp:inline distT="0" distB="0" distL="0" distR="0" wp14:anchorId="47BF5303" wp14:editId="77AB63D7">
+            <wp:extent cx="3123759" cy="2487994"/>
+            <wp:effectExtent l="0" t="0" r="635" b="7620"/>
             <wp:docPr id="241714999" name="Picture 1"/>
             <wp:cNvGraphicFramePr>
               <a:graphicFrameLocks xmlns:a="http://schemas.openxmlformats.org/drawingml/2006/main" noChangeAspect="1"/>
@@ -2008,7 +2258,7 @@
                     <pic:cNvPicPr/>
                   </pic:nvPicPr>
                   <pic:blipFill>
-                    <a:blip r:embed="rId16"/>
+                    <a:blip r:embed="rId20"/>
                     <a:stretch>
                       <a:fillRect/>
                     </a:stretch>
@@ -2016,7 +2266,7 @@
                   <pic:spPr>
                     <a:xfrm>
                       <a:off x="0" y="0"/>
-                      <a:ext cx="4266956" cy="3398521"/>
+                      <a:ext cx="3143914" cy="2504047"/>
                     </a:xfrm>
                     <a:prstGeom prst="rect">
                       <a:avLst/>
@@ -2136,7 +2386,6 @@
                 <w:noProof/>
                 <w:lang w:val="sv-SE"/>
               </w:rPr>
-              <w:lastRenderedPageBreak/>
               <w:drawing>
                 <wp:inline distT="0" distB="0" distL="0" distR="0" wp14:anchorId="55EDF894" wp14:editId="25661EEF">
                   <wp:extent cx="3249290" cy="3314901"/>
@@ -2153,7 +2402,7 @@
                           <pic:cNvPicPr/>
                         </pic:nvPicPr>
                         <pic:blipFill>
-                          <a:blip r:embed="rId17"/>
+                          <a:blip r:embed="rId21"/>
                           <a:stretch>
                             <a:fillRect/>
                           </a:stretch>
@@ -2211,7 +2460,7 @@
                           <pic:cNvPicPr/>
                         </pic:nvPicPr>
                         <pic:blipFill>
-                          <a:blip r:embed="rId18"/>
+                          <a:blip r:embed="rId22"/>
                           <a:stretch>
                             <a:fillRect/>
                           </a:stretch>
@@ -2235,6 +2484,83 @@
         </w:tc>
       </w:tr>
     </w:tbl>
+    <w:p>
+      <w:pPr>
+        <w:jc w:val="center"/>
+        <w:rPr>
+          <w:rFonts w:ascii="Times New Roman" w:hAnsi="Times New Roman" w:cs="Times New Roman"/>
+          <w:b/>
+          <w:bCs/>
+          <w:lang w:val="sv-SE"/>
+        </w:rPr>
+      </w:pPr>
+    </w:p>
+    <w:p>
+      <w:pPr>
+        <w:jc w:val="center"/>
+        <w:rPr>
+          <w:rFonts w:ascii="Times New Roman" w:hAnsi="Times New Roman" w:cs="Times New Roman"/>
+          <w:b/>
+          <w:bCs/>
+          <w:lang w:val="sv-SE"/>
+        </w:rPr>
+      </w:pPr>
+    </w:p>
+    <w:p>
+      <w:pPr>
+        <w:jc w:val="center"/>
+        <w:rPr>
+          <w:rFonts w:ascii="Times New Roman" w:hAnsi="Times New Roman" w:cs="Times New Roman"/>
+          <w:b/>
+          <w:bCs/>
+          <w:lang w:val="sv-SE"/>
+        </w:rPr>
+      </w:pPr>
+      <w:r>
+        <w:rPr>
+          <w:rFonts w:ascii="Times New Roman" w:hAnsi="Times New Roman" w:cs="Times New Roman"/>
+          <w:b/>
+          <w:bCs/>
+          <w:lang w:val="sv-SE"/>
+        </w:rPr>
+        <w:lastRenderedPageBreak/>
+        <w:drawing>
+          <wp:inline distT="0" distB="0" distL="0" distR="0" wp14:anchorId="3A5F7E85" wp14:editId="04F54B47">
+            <wp:extent cx="4936703" cy="2580693"/>
+            <wp:effectExtent l="0" t="0" r="0" b="0"/>
+            <wp:docPr id="188613583" name="Picture 1"/>
+            <wp:cNvGraphicFramePr>
+              <a:graphicFrameLocks xmlns:a="http://schemas.openxmlformats.org/drawingml/2006/main" noChangeAspect="1"/>
+            </wp:cNvGraphicFramePr>
+            <a:graphic xmlns:a="http://schemas.openxmlformats.org/drawingml/2006/main">
+              <a:graphicData uri="http://schemas.openxmlformats.org/drawingml/2006/picture">
+                <pic:pic xmlns:pic="http://schemas.openxmlformats.org/drawingml/2006/picture">
+                  <pic:nvPicPr>
+                    <pic:cNvPr id="188613583" name=""/>
+                    <pic:cNvPicPr/>
+                  </pic:nvPicPr>
+                  <pic:blipFill>
+                    <a:blip r:embed="rId23"/>
+                    <a:stretch>
+                      <a:fillRect/>
+                    </a:stretch>
+                  </pic:blipFill>
+                  <pic:spPr>
+                    <a:xfrm>
+                      <a:off x="0" y="0"/>
+                      <a:ext cx="4952707" cy="2589059"/>
+                    </a:xfrm>
+                    <a:prstGeom prst="rect">
+                      <a:avLst/>
+                    </a:prstGeom>
+                  </pic:spPr>
+                </pic:pic>
+              </a:graphicData>
+            </a:graphic>
+          </wp:inline>
+        </w:drawing>
+      </w:r>
+    </w:p>
     <w:p>
       <w:pPr>
         <w:jc w:val="center"/>
@@ -2358,7 +2684,7 @@
                           <pic:cNvPicPr/>
                         </pic:nvPicPr>
                         <pic:blipFill>
-                          <a:blip r:embed="rId19"/>
+                          <a:blip r:embed="rId24"/>
                           <a:stretch>
                             <a:fillRect/>
                           </a:stretch>
@@ -2414,7 +2740,7 @@
                           <pic:cNvPicPr/>
                         </pic:nvPicPr>
                         <pic:blipFill>
-                          <a:blip r:embed="rId20"/>
+                          <a:blip r:embed="rId25"/>
                           <a:stretch>
                             <a:fillRect/>
                           </a:stretch>
@@ -2563,7 +2889,7 @@
                           <pic:cNvPicPr/>
                         </pic:nvPicPr>
                         <pic:blipFill>
-                          <a:blip r:embed="rId21"/>
+                          <a:blip r:embed="rId26"/>
                           <a:stretch>
                             <a:fillRect/>
                           </a:stretch>
@@ -2619,7 +2945,7 @@
                           <pic:cNvPicPr/>
                         </pic:nvPicPr>
                         <pic:blipFill>
-                          <a:blip r:embed="rId22"/>
+                          <a:blip r:embed="rId27"/>
                           <a:stretch>
                             <a:fillRect/>
                           </a:stretch>
@@ -2643,6 +2969,15 @@
         </w:tc>
       </w:tr>
     </w:tbl>
+    <w:p>
+      <w:pPr>
+        <w:jc w:val="center"/>
+        <w:rPr>
+          <w:rFonts w:ascii="Times New Roman" w:hAnsi="Times New Roman" w:cs="Times New Roman"/>
+          <w:lang w:val="sv-SE"/>
+        </w:rPr>
+      </w:pPr>
+    </w:p>
     <w:p>
       <w:pPr>
         <w:jc w:val="center"/>
@@ -2746,7 +3081,7 @@
                           <pic:cNvPicPr/>
                         </pic:nvPicPr>
                         <pic:blipFill>
-                          <a:blip r:embed="rId23"/>
+                          <a:blip r:embed="rId28"/>
                           <a:stretch>
                             <a:fillRect/>
                           </a:stretch>
@@ -2787,8 +3122,8 @@
                 <w:lang w:val="sv-SE"/>
               </w:rPr>
               <w:drawing>
-                <wp:inline distT="0" distB="0" distL="0" distR="0" wp14:anchorId="320AD615" wp14:editId="42231D23">
-                  <wp:extent cx="2383783" cy="939649"/>
+                <wp:inline distT="0" distB="0" distL="0" distR="0" wp14:anchorId="320AD615" wp14:editId="01FA952A">
+                  <wp:extent cx="2193503" cy="864644"/>
                   <wp:effectExtent l="0" t="0" r="0" b="0"/>
                   <wp:docPr id="2065038461" name="Picture 1"/>
                   <wp:cNvGraphicFramePr>
@@ -2802,7 +3137,7 @@
                           <pic:cNvPicPr/>
                         </pic:nvPicPr>
                         <pic:blipFill>
-                          <a:blip r:embed="rId24"/>
+                          <a:blip r:embed="rId29"/>
                           <a:stretch>
                             <a:fillRect/>
                           </a:stretch>
@@ -2810,7 +3145,7 @@
                         <pic:spPr>
                           <a:xfrm>
                             <a:off x="0" y="0"/>
-                            <a:ext cx="2423919" cy="955470"/>
+                            <a:ext cx="2238826" cy="882509"/>
                           </a:xfrm>
                           <a:prstGeom prst="rect">
                             <a:avLst/>
@@ -2852,6 +3187,25 @@
           <w:lang w:val="sv-SE"/>
         </w:rPr>
       </w:pPr>
+    </w:p>
+    <w:p>
+      <w:pPr>
+        <w:rPr>
+          <w:rFonts w:ascii="Times New Roman" w:hAnsi="Times New Roman" w:cs="Times New Roman"/>
+          <w:i/>
+          <w:iCs/>
+          <w:lang w:val="sv-SE"/>
+        </w:rPr>
+      </w:pPr>
+      <w:r>
+        <w:rPr>
+          <w:rFonts w:ascii="Times New Roman" w:hAnsi="Times New Roman" w:cs="Times New Roman"/>
+          <w:i/>
+          <w:iCs/>
+          <w:lang w:val="sv-SE"/>
+        </w:rPr>
+        <w:t>Estimasi regresi</w:t>
+      </w:r>
     </w:p>
     <w:p>
       <w:pPr>

</xml_diff>